<commit_message>
AA-8 KOS-24 specifica: proprietà dei profili verificata (account KOS), rimando alla baseline
Co-Authored-By: Claude Opus 5.5 <noreply@anthropic.com>
Claude-Session: https://claude.ai/code/session_01Rr1X44gsg7BUwMzrRvYrc2
</commit_message>
<xml_diff>
--- a/docs/docx/specifica-grafo-kos.docx
+++ b/docs/docx/specifica-grafo-kos.docx
@@ -368,7 +368,19 @@
         <w:t xml:space="preserve"> </w:t>
       </w:r>
       <w:r>
-        <w:t xml:space="preserve">baseline (decisione del 30/10).</w:t>
+        <w:t xml:space="preserve">baseline (decisione del 30/10). Proprietà verificata il 30/10 (account KOS su tutti i gruppi); baseline in</w:t>
+      </w:r>
+      <w:r>
+        <w:t xml:space="preserve"> </w:t>
+      </w:r>
+      <w:r>
+        <w:rPr>
+          <w:rStyle w:val="VerbatimChar"/>
+        </w:rPr>
+        <w:t xml:space="preserve">docs/baseline-schede-20261030.md</w:t>
+      </w:r>
+      <w:r>
+        <w:t xml:space="preserve">.</w:t>
       </w:r>
     </w:p>
     <w:bookmarkEnd w:id="22"/>
@@ -6404,13 +6416,13 @@
         <w:t xml:space="preserve">Proprietà dei profili</w:t>
       </w:r>
       <w:r>
-        <w:t xml:space="preserve">: trasferimento di tutti i gruppi da Yext a un account KOS, verificato nel pannello prima</w:t>
-      </w:r>
-      <w:r>
-        <w:t xml:space="preserve"> </w:t>
-      </w:r>
-      <w:r>
-        <w:t xml:space="preserve">della dismissione di Yext.</w:t>
+        <w:t xml:space="preserve">: verificato da Danilo il 30/10, tutti i gruppi hanno come proprietario principale un account</w:t>
+      </w:r>
+      <w:r>
+        <w:t xml:space="preserve"> </w:t>
+      </w:r>
+      <w:r>
+        <w:t xml:space="preserve">KOS. Resta da togliere l'accesso di Yext alla dismissione e da dare a RetailTune il ruolo di gestore.</w:t>
       </w:r>
     </w:p>
     <w:p>

</xml_diff>